<commit_message>
Respaldo actual del sistema dental
</commit_message>
<xml_diff>
--- a/Plantilla/Plantilla quimica laboratorio.docx
+++ b/Plantilla/Plantilla quimica laboratorio.docx
@@ -15650,11 +15650,11 @@
         </mc:Choice>
         <mc:Fallback>
           <w:pict>
-            <v:shapetype w14:anchorId="0E342834" id="_x0000_t202" coordsize="21600,21600" o:spt="202" path="m,l,21600r21600,l21600,xe">
+            <v:shapetype w14:anchorId="74EE69FC" id="_x0000_t202" coordsize="21600,21600" o:spt="202" path="m,l,21600r21600,l21600,xe">
               <v:stroke joinstyle="miter"/>
               <v:path gradientshapeok="t" o:connecttype="rect"/>
             </v:shapetype>
-            <v:shape id="Cuadro de texto 2" o:spid="_x0000_s1027" type="#_x0000_t202" style="position:absolute;margin-left:-36.75pt;margin-top:6.05pt;width:611.75pt;height:39.25pt;z-index:-251660288;visibility:visible;mso-wrap-style:square;mso-width-percent:0;mso-height-percent:0;mso-wrap-distance-left:9pt;mso-wrap-distance-top:3.6pt;mso-wrap-distance-right:9pt;mso-wrap-distance-bottom:3.6pt;mso-position-horizontal:absolute;mso-position-horizontal-relative:margin;mso-position-vertical:absolute;mso-position-vertical-relative:text;mso-width-percent:0;mso-height-percent:0;mso-width-relative:margin;mso-height-relative:margin;v-text-anchor:middle" o:gfxdata="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" fillcolor="#090" strokecolor="#00b050">
+            <v:shape id="Cuadro de texto 2" o:spid="_x0000_s1027" type="#_x0000_t202" style="position:absolute;margin-left:-36.75pt;margin-top:6.05pt;width:611.75pt;height:39.25pt;z-index:-251660288;visibility:visible;mso-wrap-style:square;mso-width-percent:0;mso-height-percent:0;mso-wrap-distance-left:9pt;mso-wrap-distance-top:3.6pt;mso-wrap-distance-right:9pt;mso-wrap-distance-bottom:3.6pt;mso-position-horizontal:absolute;mso-position-horizontal-relative:margin;mso-position-vertical:absolute;mso-position-vertical-relative:text;mso-width-percent:0;mso-height-percent:0;mso-width-relative:margin;mso-height-relative:margin;v-text-anchor:middle" o:gfxdata="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" fillcolor="#090" strokecolor="#00b050">
               <v:textbox>
                 <w:txbxContent>
                   <w:p>
@@ -18467,11 +18467,11 @@
         </mc:Choice>
         <mc:Fallback>
           <w:pict>
-            <v:shapetype w14:anchorId="0E342834" id="_x0000_t202" coordsize="21600,21600" o:spt="202" path="m,l,21600r21600,l21600,xe">
+            <v:shapetype w14:anchorId="1EA4DDDB" id="_x0000_t202" coordsize="21600,21600" o:spt="202" path="m,l,21600r21600,l21600,xe">
               <v:stroke joinstyle="miter"/>
               <v:path gradientshapeok="t" o:connecttype="rect"/>
             </v:shapetype>
-            <v:shape id="_x0000_s1029" type="#_x0000_t202" style="position:absolute;margin-left:-36.75pt;margin-top:6.05pt;width:611.75pt;height:39.25pt;z-index:-251663360;visibility:visible;mso-wrap-style:square;mso-width-percent:0;mso-height-percent:0;mso-wrap-distance-left:9pt;mso-wrap-distance-top:3.6pt;mso-wrap-distance-right:9pt;mso-wrap-distance-bottom:3.6pt;mso-position-horizontal:absolute;mso-position-horizontal-relative:margin;mso-position-vertical:absolute;mso-position-vertical-relative:text;mso-width-percent:0;mso-height-percent:0;mso-width-relative:margin;mso-height-relative:margin;v-text-anchor:middle" o:gfxdata="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" fillcolor="#090" strokecolor="#00b050">
+            <v:shape id="_x0000_s1029" type="#_x0000_t202" style="position:absolute;margin-left:-36.75pt;margin-top:6.05pt;width:611.75pt;height:39.25pt;z-index:-251663360;visibility:visible;mso-wrap-style:square;mso-width-percent:0;mso-height-percent:0;mso-wrap-distance-left:9pt;mso-wrap-distance-top:3.6pt;mso-wrap-distance-right:9pt;mso-wrap-distance-bottom:3.6pt;mso-position-horizontal:absolute;mso-position-horizontal-relative:margin;mso-position-vertical:absolute;mso-position-vertical-relative:text;mso-width-percent:0;mso-height-percent:0;mso-width-relative:margin;mso-height-relative:margin;v-text-anchor:middle" o:gfxdata="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" fillcolor="#090" strokecolor="#00b050">
               <v:textbox>
                 <w:txbxContent>
                   <w:p>
@@ -20110,11 +20110,11 @@
         </mc:Choice>
         <mc:Fallback>
           <w:pict>
-            <v:shapetype w14:anchorId="3887FAF6" id="_x0000_t202" coordsize="21600,21600" o:spt="202" path="m,l,21600r21600,l21600,xe">
+            <v:shapetype w14:anchorId="7DFB6155" id="_x0000_t202" coordsize="21600,21600" o:spt="202" path="m,l,21600r21600,l21600,xe">
               <v:stroke joinstyle="miter"/>
               <v:path gradientshapeok="t" o:connecttype="rect"/>
             </v:shapetype>
-            <v:shape id="Cuadro de texto 1" o:spid="_x0000_s1026" type="#_x0000_t202" style="position:absolute;left:0;text-align:left;margin-left:357.6pt;margin-top:.55pt;width:189.4pt;height:37.9pt;z-index:251657216;visibility:visible;mso-wrap-style:square;mso-width-percent:0;mso-height-percent:0;mso-wrap-distance-left:9pt;mso-wrap-distance-top:3.6pt;mso-wrap-distance-right:9pt;mso-wrap-distance-bottom:3.6pt;mso-position-horizontal:absolute;mso-position-horizontal-relative:text;mso-position-vertical:absolute;mso-position-vertical-relative:text;mso-width-percent:0;mso-height-percent:0;mso-width-relative:margin;mso-height-relative:margin;v-text-anchor:top" o:gfxdata="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" filled="f" stroked="f">
+            <v:shape id="Cuadro de texto 1" o:spid="_x0000_s1026" type="#_x0000_t202" style="position:absolute;left:0;text-align:left;margin-left:357.6pt;margin-top:.55pt;width:189.4pt;height:37.9pt;z-index:251657216;visibility:visible;mso-wrap-style:square;mso-width-percent:0;mso-height-percent:0;mso-wrap-distance-left:9pt;mso-wrap-distance-top:3.6pt;mso-wrap-distance-right:9pt;mso-wrap-distance-bottom:3.6pt;mso-position-horizontal:absolute;mso-position-horizontal-relative:text;mso-position-vertical:absolute;mso-position-vertical-relative:text;mso-width-percent:0;mso-height-percent:0;mso-width-relative:margin;mso-height-relative:margin;v-text-anchor:top" o:gfxdata="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" filled="f" stroked="f">
               <v:textbox>
                 <w:txbxContent>
                   <w:p>
@@ -20160,7 +20160,7 @@
                         <w:lang w:val="es-MX" w:eastAsia="es-MX"/>
                       </w:rPr>
                       <w:drawing>
-                        <wp:inline distT="0" distB="0" distL="0" distR="0" wp14:anchorId="0121783F" wp14:editId="7C0EC4D3">
+                        <wp:inline distT="0" distB="0" distL="0" distR="0" wp14:anchorId="157A53CF" wp14:editId="10EDE6DF">
                           <wp:extent cx="152400" cy="152400"/>
                           <wp:effectExtent l="0" t="0" r="0" b="0"/>
                           <wp:docPr id="5" name="Imagen 5" descr="Whatsapp PNG images free download"/>
@@ -20177,7 +20177,7 @@
                                   </pic:cNvPicPr>
                                 </pic:nvPicPr>
                                 <pic:blipFill>
-                                  <a:blip r:embed="rId2">
+                                  <a:blip r:embed="rId1">
                                     <a:extLst>
                                       <a:ext uri="{28A0092B-C50C-407E-A947-70E740481C1C}">
                                         <a14:useLocalDpi xmlns:a14="http://schemas.microsoft.com/office/drawing/2010/main" val="0"/>
@@ -20274,7 +20274,7 @@
                   </pic:cNvPicPr>
                 </pic:nvPicPr>
                 <pic:blipFill>
-                  <a:blip r:embed="rId3" cstate="print">
+                  <a:blip r:embed="rId2" cstate="print">
                     <a:extLst>
                       <a:ext uri="{28A0092B-C50C-407E-A947-70E740481C1C}">
                         <a14:useLocalDpi xmlns:a14="http://schemas.microsoft.com/office/drawing/2010/main" val="0"/>
@@ -20338,7 +20338,7 @@
           <o:lock v:ext="edit" aspectratio="t"/>
         </v:shapetype>
         <v:shape id="_x0000_s1033" type="#_x0000_t75" style="position:absolute;left:0;text-align:left;margin-left:0;margin-top:0;width:293pt;height:460.95pt;z-index:-251653120;mso-position-horizontal:center;mso-position-horizontal-relative:margin;mso-position-vertical:center;mso-position-vertical-relative:margin" o:allowincell="f">
-          <v:imagedata r:id="rId4" o:title="logo2017 verde"/>
+          <v:imagedata r:id="rId3" o:title="logo2017 verde"/>
           <w10:wrap anchorx="margin" anchory="margin"/>
         </v:shape>
       </w:pict>
@@ -20719,11 +20719,11 @@
         </mc:Choice>
         <mc:Fallback>
           <w:pict>
-            <v:shapetype w14:anchorId="3887FAF6" id="_x0000_t202" coordsize="21600,21600" o:spt="202" path="m,l,21600r21600,l21600,xe">
+            <v:shapetype w14:anchorId="64EA3E30" id="_x0000_t202" coordsize="21600,21600" o:spt="202" path="m,l,21600r21600,l21600,xe">
               <v:stroke joinstyle="miter"/>
               <v:path gradientshapeok="t" o:connecttype="rect"/>
             </v:shapetype>
-            <v:shape id="_x0000_s1028" type="#_x0000_t202" style="position:absolute;left:0;text-align:left;margin-left:357.6pt;margin-top:.55pt;width:189.4pt;height:37.9pt;z-index:251654144;visibility:visible;mso-wrap-style:square;mso-width-percent:0;mso-height-percent:0;mso-wrap-distance-left:9pt;mso-wrap-distance-top:3.6pt;mso-wrap-distance-right:9pt;mso-wrap-distance-bottom:3.6pt;mso-position-horizontal:absolute;mso-position-horizontal-relative:text;mso-position-vertical:absolute;mso-position-vertical-relative:text;mso-width-percent:0;mso-height-percent:0;mso-width-relative:margin;mso-height-relative:margin;v-text-anchor:top" o:gfxdata="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" filled="f" stroked="f">
+            <v:shape id="_x0000_s1028" type="#_x0000_t202" style="position:absolute;left:0;text-align:left;margin-left:357.6pt;margin-top:.55pt;width:189.4pt;height:37.9pt;z-index:251654144;visibility:visible;mso-wrap-style:square;mso-width-percent:0;mso-height-percent:0;mso-wrap-distance-left:9pt;mso-wrap-distance-top:3.6pt;mso-wrap-distance-right:9pt;mso-wrap-distance-bottom:3.6pt;mso-position-horizontal:absolute;mso-position-horizontal-relative:text;mso-position-vertical:absolute;mso-position-vertical-relative:text;mso-width-percent:0;mso-height-percent:0;mso-width-relative:margin;mso-height-relative:margin;v-text-anchor:top" o:gfxdata="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" filled="f" stroked="f">
               <v:textbox>
                 <w:txbxContent>
                   <w:p>
@@ -20769,7 +20769,7 @@
                         <w:lang w:val="es-MX" w:eastAsia="es-MX"/>
                       </w:rPr>
                       <w:drawing>
-                        <wp:inline distT="0" distB="0" distL="0" distR="0" wp14:anchorId="0121783F" wp14:editId="7C0EC4D3">
+                        <wp:inline distT="0" distB="0" distL="0" distR="0" wp14:anchorId="11BEB51B" wp14:editId="5C369A35">
                           <wp:extent cx="152400" cy="152400"/>
                           <wp:effectExtent l="0" t="0" r="0" b="0"/>
                           <wp:docPr id="10" name="Imagen 10" descr="Whatsapp PNG images free download"/>
@@ -20786,7 +20786,7 @@
                                   </pic:cNvPicPr>
                                 </pic:nvPicPr>
                                 <pic:blipFill>
-                                  <a:blip r:embed="rId2">
+                                  <a:blip r:embed="rId1">
                                     <a:extLst>
                                       <a:ext uri="{28A0092B-C50C-407E-A947-70E740481C1C}">
                                         <a14:useLocalDpi xmlns:a14="http://schemas.microsoft.com/office/drawing/2010/main" val="0"/>
@@ -20883,7 +20883,7 @@
                   </pic:cNvPicPr>
                 </pic:nvPicPr>
                 <pic:blipFill>
-                  <a:blip r:embed="rId3" cstate="print">
+                  <a:blip r:embed="rId2" cstate="print">
                     <a:extLst>
                       <a:ext uri="{28A0092B-C50C-407E-A947-70E740481C1C}">
                         <a14:useLocalDpi xmlns:a14="http://schemas.microsoft.com/office/drawing/2010/main" val="0"/>
@@ -20947,7 +20947,7 @@
           <o:lock v:ext="edit" aspectratio="t"/>
         </v:shapetype>
         <v:shape id="WordPictureWatermark191203752" o:spid="_x0000_s1027" type="#_x0000_t75" style="position:absolute;left:0;text-align:left;margin-left:0;margin-top:0;width:293pt;height:460.95pt;z-index:-251657216;mso-position-horizontal:center;mso-position-horizontal-relative:margin;mso-position-vertical:center;mso-position-vertical-relative:margin" o:allowincell="f">
-          <v:imagedata r:id="rId4" o:title="logo2017 verde"/>
+          <v:imagedata r:id="rId3" o:title="logo2017 verde"/>
           <w10:wrap anchorx="margin" anchory="margin"/>
         </v:shape>
       </w:pict>
@@ -21107,7 +21107,7 @@
         <v:path o:extrusionok="f" gradientshapeok="t" o:connecttype="rect"/>
         <o:lock v:ext="edit" aspectratio="t"/>
       </v:shapetype>
-      <v:shape id="_x0000_i1030" type="#_x0000_t75" alt="Resultado de imagen para logo gmail png" style="width:506.25pt;height:383.25pt;visibility:visible" o:bullet="t">
+      <v:shape id="_x0000_i1033" type="#_x0000_t75" alt="Resultado de imagen para logo gmail png" style="width:506.8pt;height:383.4pt;visibility:visible" o:bullet="t">
         <v:imagedata r:id="rId1" o:title="Resultado de imagen para logo gmail png"/>
       </v:shape>
     </w:pict>

</xml_diff>